<commit_message>
Update project documentation (.docx) with technical architecture diagram
</commit_message>
<xml_diff>
--- a/Pricing_Promotion_Analyzer_Project_Documentation.docx
+++ b/Pricing_Promotion_Analyzer_Project_Documentation.docx
@@ -104,6 +104,57 @@
       </w:r>
     </w:p>
     <w:p>
+      <w:pPr>
+        <w:jc w:val="center"/>
+      </w:pPr>
+      <w:r>
+        <w:drawing>
+          <wp:inline xmlns:a="http://schemas.openxmlformats.org/drawingml/2006/main" xmlns:pic="http://schemas.openxmlformats.org/drawingml/2006/picture">
+            <wp:extent cx="5486400" cy="5486400"/>
+            <wp:docPr id="1" name="Picture 1"/>
+            <wp:cNvGraphicFramePr>
+              <a:graphicFrameLocks noChangeAspect="1"/>
+            </wp:cNvGraphicFramePr>
+            <a:graphic>
+              <a:graphicData uri="http://schemas.openxmlformats.org/drawingml/2006/picture">
+                <pic:pic>
+                  <pic:nvPicPr>
+                    <pic:cNvPr id="0" name="technical_architecture_diagram_1782279556736.png"/>
+                    <pic:cNvPicPr/>
+                  </pic:nvPicPr>
+                  <pic:blipFill>
+                    <a:blip r:embed="rId9"/>
+                    <a:stretch>
+                      <a:fillRect/>
+                    </a:stretch>
+                  </pic:blipFill>
+                  <pic:spPr>
+                    <a:xfrm>
+                      <a:off x="0" y="0"/>
+                      <a:ext cx="5486400" cy="5486400"/>
+                    </a:xfrm>
+                    <a:prstGeom prst="rect"/>
+                  </pic:spPr>
+                </pic:pic>
+              </a:graphicData>
+            </a:graphic>
+          </wp:inline>
+        </w:drawing>
+      </w:r>
+    </w:p>
+    <w:p>
+      <w:pPr>
+        <w:jc w:val="center"/>
+      </w:pPr>
+      <w:r>
+        <w:rPr>
+          <w:i/>
+          <w:sz w:val="20"/>
+        </w:rPr>
+        <w:t>Figure 1: Pricing &amp; Promotion Impact Analyzer Technical Architecture</w:t>
+      </w:r>
+    </w:p>
+    <w:p>
       <w:r>
         <w:t>The Pricing &amp; Promotion Impact Analyzer uses a modular three-tier layout:</w:t>
         <w:br/>
@@ -111,7 +162,7 @@
         <w:br/>
         <w:t>2. Backend: A Python-based processing tier. The ingestion engine populates a SQLite database (`retail_marketing.db`) from raw CSV sheets. The analytics engine runs SQL queries and Pandas aggregations to calculate sales KPIs, customer segment spending, and ad campaign ROI.</w:t>
         <w:br/>
-        <w:t>3. AI Chat Agent: A natural language query engine (`agent_engine.py`) that implements user settings for online APIs (Groq, OpenAI, Gemini) and falls back to a simulated query processor to run offline database lookups and return jargon-free, conversational answers.</w:t>
+        <w:t>3. AI Chat Layer: A natural language query engine (`agent_engine.py`) that implements user settings for online APIs (Groq, OpenAI, Gemini) and falls back to a simulated query processor to run offline database lookups and return jargon-free, conversational answers.</w:t>
       </w:r>
     </w:p>
     <w:p>

</xml_diff>

<commit_message>
Expand project documentation (.docx) with sub-activities, detailed student-friendly descriptions, and screenshot placeholders
</commit_message>
<xml_diff>
--- a/Pricing_Promotion_Analyzer_Project_Documentation.docx
+++ b/Pricing_Promotion_Analyzer_Project_Documentation.docx
@@ -240,10 +240,10 @@
       </w:r>
     </w:p>
     <w:p>
-      <w:pPr>
-        <w:pStyle w:val="ListBullet"/>
-      </w:pPr>
       <w:r>
+        <w:rPr>
+          <w:b/>
+        </w:rPr>
         <w:t>Milestone 1: Database Setup and Ingestion</w:t>
       </w:r>
     </w:p>
@@ -252,6 +252,30 @@
         <w:pStyle w:val="ListBullet"/>
       </w:pPr>
       <w:r>
+        <w:t>Activity 1.1: Database Schema &amp; SQLite Setup (Creating structured database file and tables)</w:t>
+      </w:r>
+    </w:p>
+    <w:p>
+      <w:pPr>
+        <w:pStyle w:val="ListBullet"/>
+      </w:pPr>
+      <w:r>
+        <w:t>Activity 1.2: CSV Data Ingestion and Table Load (Reading raw spreadsheets and loading into database)</w:t>
+      </w:r>
+    </w:p>
+    <w:p>
+      <w:pPr>
+        <w:pStyle w:val="ListBullet"/>
+      </w:pPr>
+      <w:r>
+        <w:t>Activity 1.3: Configure Project Structure &amp; Environment (Organizing folders and dependencies)</w:t>
+      </w:r>
+    </w:p>
+    <w:p>
+      <w:r>
+        <w:rPr>
+          <w:b/>
+        </w:rPr>
         <w:t>Milestone 2: Feature Engineering &amp; Preprocessing</w:t>
       </w:r>
     </w:p>
@@ -260,6 +284,22 @@
         <w:pStyle w:val="ListBullet"/>
       </w:pPr>
       <w:r>
+        <w:t>Activity 2.1: Implement Sales Feature Calculations (Computing sales, item costs, and actual profit metrics)</w:t>
+      </w:r>
+    </w:p>
+    <w:p>
+      <w:pPr>
+        <w:pStyle w:val="ListBullet"/>
+      </w:pPr>
+      <w:r>
+        <w:t>Activity 2.2: Implement Campaign Mapping (Connecting transactional sales to marketing channels)</w:t>
+      </w:r>
+    </w:p>
+    <w:p>
+      <w:r>
+        <w:rPr>
+          <w:b/>
+        </w:rPr>
         <w:t>Milestone 3: Customer Behavior &amp; Segmentation</w:t>
       </w:r>
     </w:p>
@@ -268,6 +308,22 @@
         <w:pStyle w:val="ListBullet"/>
       </w:pPr>
       <w:r>
+        <w:t>Activity 3.1: Implement Customer Segmentation Logic (Grouping customers by spending thresholds)</w:t>
+      </w:r>
+    </w:p>
+    <w:p>
+      <w:pPr>
+        <w:pStyle w:val="ListBullet"/>
+      </w:pPr>
+      <w:r>
+        <w:t>Activity 3.2: Map Segments to Simplified Jargon-Free Terms (Translating segments to Big Spenders, Frequent Shoppers, etc.)</w:t>
+      </w:r>
+    </w:p>
+    <w:p>
+      <w:r>
+        <w:rPr>
+          <w:b/>
+        </w:rPr>
         <w:t>Milestone 4: Core Analytics Engines</w:t>
       </w:r>
     </w:p>
@@ -276,6 +332,22 @@
         <w:pStyle w:val="ListBullet"/>
       </w:pPr>
       <w:r>
+        <w:t>Activity 4.1: Category and Campaign ROI Calculators (Ranking products and computing marketing budget efficiency)</w:t>
+      </w:r>
+    </w:p>
+    <w:p>
+      <w:pPr>
+        <w:pStyle w:val="ListBullet"/>
+      </w:pPr>
+      <w:r>
+        <w:t>Activity 4.2: Pricing Analytics &amp; Promotion Recommendations (Simulating pricing curves and finding the profit sweet spot)</w:t>
+      </w:r>
+    </w:p>
+    <w:p>
+      <w:r>
+        <w:rPr>
+          <w:b/>
+        </w:rPr>
         <w:t>Milestone 5: Streamlit Web Dashboards</w:t>
       </w:r>
     </w:p>
@@ -284,6 +356,30 @@
         <w:pStyle w:val="ListBullet"/>
       </w:pPr>
       <w:r>
+        <w:t>Activity 5.1: Multi-Page Router Implementation (Setting up app.py navigation sidebar)</w:t>
+      </w:r>
+    </w:p>
+    <w:p>
+      <w:pPr>
+        <w:pStyle w:val="ListBullet"/>
+      </w:pPr>
+      <w:r>
+        <w:t>Activity 5.2: Develop Dashboard Pages (Creating visual views for Executive, Category, Campaign, and Pricing analytics)</w:t>
+      </w:r>
+    </w:p>
+    <w:p>
+      <w:pPr>
+        <w:pStyle w:val="ListBullet"/>
+      </w:pPr>
+      <w:r>
+        <w:t>Activity 5.3: Inject Custom CSS Theme and Wide Layout (Applying dark glassmorphism styling and full-screen layouts)</w:t>
+      </w:r>
+    </w:p>
+    <w:p>
+      <w:r>
+        <w:rPr>
+          <w:b/>
+        </w:rPr>
         <w:t>Milestone 6: AI Shop Assistant Agent</w:t>
       </w:r>
     </w:p>
@@ -292,7 +388,31 @@
         <w:pStyle w:val="ListBullet"/>
       </w:pPr>
       <w:r>
+        <w:t>Activity 6.1: Implement AI Decision Agent Core (Programming the natural language query translation offline)</w:t>
+      </w:r>
+    </w:p>
+    <w:p>
+      <w:pPr>
+        <w:pStyle w:val="ListBullet"/>
+      </w:pPr>
+      <w:r>
+        <w:t>Activity 6.2: Build Chat UI and Quick Question Chips (Designing user chat interface and locking secure demo mode)</w:t>
+      </w:r>
+    </w:p>
+    <w:p>
+      <w:r>
+        <w:rPr>
+          <w:b/>
+        </w:rPr>
         <w:t>Milestone 7: Conclusion</w:t>
+      </w:r>
+    </w:p>
+    <w:p>
+      <w:pPr>
+        <w:pStyle w:val="ListBullet"/>
+      </w:pPr>
+      <w:r>
+        <w:t>Key Project Takeaways (Physics-AI complementarity, multi-task systems, user-friendly language, and UI best practices)</w:t>
       </w:r>
     </w:p>
     <w:p>
@@ -306,7 +426,6 @@
       </w:pPr>
       <w:r>
         <w:rPr>
-          <w:rFonts w:ascii="Calibri" w:hAnsi="Calibri"/>
           <w:b/>
           <w:sz w:val="28"/>
         </w:rPr>
@@ -315,7 +434,7 @@
     </w:p>
     <w:p>
       <w:r>
-        <w:t>In this milestone, we set up the local relational database structure and build the ingestion pipelines to load ecommerce raw datasets into structured tables. We configure local python virtual environments and dependencies.</w:t>
+        <w:t>In this milestone, we set up the local relational database structure and build the ingestion pipelines to load ecommerce raw datasets into structured tables. We configure local python virtual environments and dependencies. Think of this milestone as building and organizing the digital filing cabinet for the entire shop's records.</w:t>
       </w:r>
     </w:p>
     <w:p>
@@ -324,7 +443,6 @@
       </w:pPr>
       <w:r>
         <w:rPr>
-          <w:rFonts w:ascii="Calibri" w:hAnsi="Calibri"/>
           <w:b/>
           <w:sz w:val="24"/>
         </w:rPr>
@@ -332,27 +450,17 @@
       </w:r>
     </w:p>
     <w:p>
-      <w:pPr>
-        <w:pStyle w:val="ListBullet"/>
-      </w:pPr>
       <w:r>
-        <w:t>Step 1 - Schema Design: Design the relational tables in database/retail_marketing.py to store olist_orders, olist_order_items, olist_order_payments, olist_products, olist_customers, olist_sellers, and product_category_name_translation.</w:t>
+        <w:t>For a non-technical student, a Database Schema is like a blueprint for a filing cabinet. Before putting papers in, you must decide which drawers exist, what labels they have, and how they connect. SQLite is a lightweight database engine that stores all these tables inside a single local file (`retail_marketing.db`), meaning we don't need a complex server running in the cloud. It is local, secure, and fast.</w:t>
       </w:r>
     </w:p>
     <w:p>
-      <w:pPr>
-        <w:pStyle w:val="ListBullet"/>
-      </w:pPr>
       <w:r>
-        <w:t>Step 2 - Database Creation: Establish the database connection to database/retail_marketing.db and build the tables using SQLite SQL scripts.</w:t>
-      </w:r>
-    </w:p>
-    <w:p>
-      <w:pPr>
-        <w:pStyle w:val="ListBullet"/>
-      </w:pPr>
-      <w:r>
-        <w:t>Step 3 - Index Configuration: Set primary keys on order_id, product_id, and customer_id to ensure fast joins during querying.</w:t>
+        <w:t>• Step 1 - Schema Design: We design the blueprint inside `database/retail_marketing.py`. We define tables like olist_orders (bills), olist_order_items (products inside bills), olist_products (item descriptions), and olist_customers. Each column is defined with a specific type (e.g., text for names, numbers for prices).</w:t>
+        <w:br/>
+        <w:t>• Step 2 - Database Creation: We run a script to establish a connection to `database/retail_marketing.db`. If the file does not exist, SQLite automatically creates it and runs SQL scripts to build the empty tables.</w:t>
+        <w:br/>
+        <w:t>• Step 3 - Index Configuration: Just like the index at the back of a thick textbook allows you to quickly find a topic without flipping through every page, Database Indexes are search shortcuts. We set primary key indexes on unique IDs like `order_id`, `product_id`, and `customer_id` so the system can link tables together instantly.</w:t>
       </w:r>
     </w:p>
     <w:p>
@@ -361,7 +469,6 @@
       </w:pPr>
       <w:r>
         <w:rPr>
-          <w:rFonts w:ascii="Calibri" w:hAnsi="Calibri"/>
           <w:b/>
           <w:sz w:val="24"/>
         </w:rPr>
@@ -369,27 +476,17 @@
       </w:r>
     </w:p>
     <w:p>
-      <w:pPr>
-        <w:pStyle w:val="ListBullet"/>
-      </w:pPr>
       <w:r>
-        <w:t>Step 1 - File Mapping: Set up src/ingestion/load_csv.py and database_loader.py to read raw CSV files from data/raw/.</w:t>
+        <w:t>Data Ingestion is the process of importing raw files (like CSV spreadsheets) and loading them into our database tables. If a file is extremely large (like millions of customer addresses), loading it all at once can crash your computer's memory (RAM). To prevent this, we use a technique called 'Chunk Processing'—which is like reading a thick book page-by-page rather than trying to read all pages simultaneously.</w:t>
       </w:r>
     </w:p>
     <w:p>
-      <w:pPr>
-        <w:pStyle w:val="ListBullet"/>
-      </w:pPr>
       <w:r>
-        <w:t>Step 2 - Chunk Processing: Read CSV sheets in chunks using Pandas read_csv to prevent memory overload for larger files (e.g. geolocation data).</w:t>
-      </w:r>
-    </w:p>
-    <w:p>
-      <w:pPr>
-        <w:pStyle w:val="ListBullet"/>
-      </w:pPr>
-      <w:r>
-        <w:t>Step 3 - DB Write: Execute df.to_sql commands to insert the loaded rows into the corresponding SQLite tables, ensuring data integrity.</w:t>
+        <w:t>• Step 1 - File Mapping: We create `src/ingestion/load_csv.py` and `database_loader.py` to map raw CSV files in `data/raw/` to the empty SQLite database tables we built in Activity 1.1.</w:t>
+        <w:br/>
+        <w:t>• Step 2 - Chunk Processing: We write python code using Pandas (`pd.read_csv` with the `chunksize` parameter) to read the large spreadsheets in small batches of 10,000 rows at a time. This keeps our memory consumption low and safe.</w:t>
+        <w:br/>
+        <w:t>• Step 3 - DB Write: We execute `df.to_sql` commands, which write these batches directly into the SQLite tables, checking that data is inserted cleanly without duplicates.</w:t>
       </w:r>
     </w:p>
     <w:p>
@@ -398,7 +495,6 @@
       </w:pPr>
       <w:r>
         <w:rPr>
-          <w:rFonts w:ascii="Calibri" w:hAnsi="Calibri"/>
           <w:b/>
           <w:sz w:val="24"/>
         </w:rPr>
@@ -406,27 +502,31 @@
       </w:r>
     </w:p>
     <w:p>
-      <w:pPr>
-        <w:pStyle w:val="ListBullet"/>
-      </w:pPr>
       <w:r>
-        <w:t>Step 1 - Workspace Setup: Organize the project directories (dashboard/, data/, database/, src/, tests/) to separate ingestion, analytics, and frontend scripts.</w:t>
+        <w:t>Before writing code, we need a clean, organized workspace. A 'Virtual Environment' (`.venv`) is like an isolated sandbox or a personal toolbox on your computer. It contains only the specific versions of packages (like Streamlit or Pandas) needed for this project, ensuring that other python apps on your machine do not interfere with this dashboard.</w:t>
+      </w:r>
+    </w:p>
+    <w:p>
+      <w:r>
+        <w:t>• Step 1 - Workspace Setup: We create a modular folder layout: `dashboard/` for user screens, `data/` for CSV sheets, `database/` for DB files, and `src/` for backend scripts. This ensures a clean workspace.</w:t>
+        <w:br/>
+        <w:t>• Step 2 - Virtual Env: We run commands to initialize a local virtual environment (.venv) inside the folder.</w:t>
+        <w:br/>
+        <w:t>• Step 3 - Dependency Install: We write a list of required packages into `requirements.txt` (including streamlit, pandas, plotly, python-docx) and run `pip install` to download them into our isolated virtual environment toolbox.</w:t>
       </w:r>
     </w:p>
     <w:p>
       <w:pPr>
-        <w:pStyle w:val="ListBullet"/>
+        <w:jc w:val="center"/>
       </w:pPr>
       <w:r>
-        <w:t>Step 2 - Virtual Env: Initialize a Python virtual environment (.venv) to isolate workspace libraries.</w:t>
-      </w:r>
-    </w:p>
-    <w:p>
-      <w:pPr>
-        <w:pStyle w:val="ListBullet"/>
-      </w:pPr>
-      <w:r>
-        <w:t>Step 3 - Dependency Install: Create requirements.txt listing streamlit, pandas, plotly, and python-docx, and run pip install.</w:t>
+        <w:rPr>
+          <w:b/>
+          <w:color w:val="FF6400"/>
+        </w:rPr>
+        <w:br/>
+        <w:t>[INSERT SCREENSHOT 1 HERE: Command Prompt / Terminal window showing the output of running the database_loader.py script, displaying messages like 'Ingesting olist_orders_dataset.csv in chunks...' followed by 'Database ingestion completed successfully!' and the final database file sizes.]</w:t>
+        <w:br/>
       </w:r>
     </w:p>
     <w:p>
@@ -451,7 +551,6 @@
       </w:pPr>
       <w:r>
         <w:rPr>
-          <w:rFonts w:ascii="Calibri" w:hAnsi="Calibri"/>
           <w:b/>
           <w:sz w:val="28"/>
         </w:rPr>
@@ -460,7 +559,7 @@
     </w:p>
     <w:p>
       <w:r>
-        <w:t>In this milestone, we write Python scripts to calculate transactional metrics (item cost, revenue, profit, margins) and join marketing costs to orders.</w:t>
+        <w:t>In this milestone, we write Python scripts to calculate transactional metrics (item cost, revenue, profit, margins) and join marketing costs to orders. Think of this milestone as converting raw, raw ingredients (like product prices) into useful, digestible business insights (like actual profit and ad campaign returns).</w:t>
       </w:r>
     </w:p>
     <w:p>
@@ -469,7 +568,6 @@
       </w:pPr>
       <w:r>
         <w:rPr>
-          <w:rFonts w:ascii="Calibri" w:hAnsi="Calibri"/>
           <w:b/>
           <w:sz w:val="24"/>
         </w:rPr>
@@ -477,27 +575,17 @@
       </w:r>
     </w:p>
     <w:p>
-      <w:pPr>
-        <w:pStyle w:val="ListBullet"/>
-      </w:pPr>
       <w:r>
-        <w:t>Step 1 - Load Data: Read orders, order items, and product lists into memory using Pandas from the SQLite database.</w:t>
+        <w:t>Raw spreadsheets show how much a customer paid, but they do not show how much profit the store actually kept. To find profit, we need to know the 'wholesale cost' of the item (what the store paid to buy it) and the shipping fees. 'Feature Engineering' means taking raw numbers and combining them mathematically to create new, useful indicators for business analysis.</w:t>
       </w:r>
     </w:p>
     <w:p>
-      <w:pPr>
-        <w:pStyle w:val="ListBullet"/>
-      </w:pPr>
       <w:r>
-        <w:t>Step 2 - Financial Calculations: Compute the base financials: Sales Revenue = price + freight_value. Item Cost = price * cost_factor (simulating wholesale costs). Actual Profit = Revenue - Item Cost. Profit Margin % = (Actual Profit / Revenue) * 100.</w:t>
-      </w:r>
-    </w:p>
-    <w:p>
-      <w:pPr>
-        <w:pStyle w:val="ListBullet"/>
-      </w:pPr>
-      <w:r>
-        <w:t>Step 3 - Save Features: Write the compiled table to data/processed/sales_features.csv to serve as the baseline source for the sales dashboard.</w:t>
+        <w:t>• Step 1 - Load Data: We use Pandas to load raw order tables, order items, and products into computer memory from our SQLite database.</w:t>
+        <w:br/>
+        <w:t>• Step 2 - Financial Calculations: We write mathematical code: Sales Revenue = item price + freight value (shipping paid by customer). Item Cost = item price * 0.7 (since raw datasets do not contain wholesale cost, we simulate that wholesale cost is 70% of retail price). Actual Profit = Sales Revenue - Item Cost. Profit Margin % = (Actual Profit / Sales Revenue) * 100.</w:t>
+        <w:br/>
+        <w:t>• Step 3 - Save Features: We export this table to a processed data file called `data/processed/sales_features.csv`, which will act as the direct source data for our dashboard charts.</w:t>
       </w:r>
     </w:p>
     <w:p>
@@ -506,7 +594,6 @@
       </w:pPr>
       <w:r>
         <w:rPr>
-          <w:rFonts w:ascii="Calibri" w:hAnsi="Calibri"/>
           <w:b/>
           <w:sz w:val="24"/>
         </w:rPr>
@@ -514,27 +601,31 @@
       </w:r>
     </w:p>
     <w:p>
-      <w:pPr>
-        <w:pStyle w:val="ListBullet"/>
-      </w:pPr>
       <w:r>
-        <w:t>Step 1 - Create Campaigns: Define marketing channels (Search Engines, Social Media, Email, Influencer, TV) with fixed budgets in data/processed/campaigns.csv.</w:t>
+        <w:t>If a store spends ₹10,000 on Facebook ads, it wants to know which sales were actually triggered by those ads. Campaign Mapping connects transactions (orders) with the specific marketing channels (e.g. Social Media, Email, Influencers) running at that time. This allows us to calculate how much sales revenue each advertisement brought in.</w:t>
+      </w:r>
+    </w:p>
+    <w:p>
+      <w:r>
+        <w:t>• Step 1 - Create Campaigns: We define 5 standard advertising channels with fixed budgets: Search Engines (₹50k), Social Media (₹40k), Email (₹10k), Influencer (₹30k), and TV (₹100k) inside `data/processed/campaigns.csv`.</w:t>
+        <w:br/>
+        <w:t>• Step 2 - Map Orders: We write a python script `create_campaign_sales_mapping.py` that looks at the time and category of each purchase and assigns it to an active campaign ID (simulating which ad the customer clicked before buying).</w:t>
+        <w:br/>
+        <w:t>• Step 3 - Save Mappings: We export this mapping as `data/processed/campaign_sales_mapping.csv` so we can run ROI reports.</w:t>
       </w:r>
     </w:p>
     <w:p>
       <w:pPr>
-        <w:pStyle w:val="ListBullet"/>
+        <w:jc w:val="center"/>
       </w:pPr>
       <w:r>
-        <w:t>Step 2 - Map Orders: Create src/features/create_campaign_sales_mapping.py to map each order ID to a campaign ID based on purchase timestamps and channel metadata.</w:t>
-      </w:r>
-    </w:p>
-    <w:p>
-      <w:pPr>
-        <w:pStyle w:val="ListBullet"/>
-      </w:pPr>
-      <w:r>
-        <w:t>Step 3 - Save Mappings: Export the order-campaign links to data/processed/campaign_sales_mapping.csv for marketing ROI queries.</w:t>
+        <w:rPr>
+          <w:b/>
+          <w:color w:val="FF6400"/>
+        </w:rPr>
+        <w:br/>
+        <w:t>[INSERT SCREENSHOT 2 HERE: Preview of data/processed/sales_features.csv opened in Excel or a text editor, highlighting the newly calculated columns: revenue, item_cost, actual_profit, and profit_margin_pct, showing successful data enrichment.]</w:t>
+        <w:br/>
       </w:r>
     </w:p>
     <w:p>
@@ -559,7 +650,6 @@
       </w:pPr>
       <w:r>
         <w:rPr>
-          <w:rFonts w:ascii="Calibri" w:hAnsi="Calibri"/>
           <w:b/>
           <w:sz w:val="28"/>
         </w:rPr>
@@ -568,7 +658,7 @@
     </w:p>
     <w:p>
       <w:r>
-        <w:t>In this milestone, we analyze customer order histories to partition the buyer database into distinct behavioral customer types.</w:t>
+        <w:t>In this milestone, we analyze customer order histories to partition the buyer database into distinct behavioral customer types. This is like sorting your store's visitors into distinct shopper groups so we can understand who spends the most money and what deals they respond to.</w:t>
       </w:r>
     </w:p>
     <w:p>
@@ -577,7 +667,6 @@
       </w:pPr>
       <w:r>
         <w:rPr>
-          <w:rFonts w:ascii="Calibri" w:hAnsi="Calibri"/>
           <w:b/>
           <w:sz w:val="24"/>
         </w:rPr>
@@ -585,27 +674,17 @@
       </w:r>
     </w:p>
     <w:p>
-      <w:pPr>
-        <w:pStyle w:val="ListBullet"/>
-      </w:pPr>
       <w:r>
-        <w:t>Step 1 - Group Transactions: Write src/features/create_customer_segments.py to group the sales features table by customer_id and calculate the average spend per transaction.</w:t>
+        <w:t>Instead of treating all customers identically, smart stores group them by spending behavior. We group transactions by customer unique ID and calculate the average bill size. We then establish spending thresholds (segment thresholds) to sort them: Big Spenders spend a lot per bill; Frequent Shoppers buy very often; Normal Shoppers represent the average; and Rare Shoppers visit rarely and spend small amounts.</w:t>
       </w:r>
     </w:p>
     <w:p>
-      <w:pPr>
-        <w:pStyle w:val="ListBullet"/>
-      </w:pPr>
       <w:r>
-        <w:t>Step 2 - Segment Thresholds: Segment the customer profile based on actual average spend thresholds: Big Spenders (Average spend &gt;= ₹170), Frequent Shoppers (Average spend between ₹100 and ₹170), Normal Shoppers (Average spend between ₹50 and ₹100), and Rare Shoppers (Average spend &lt; ₹50).</w:t>
-      </w:r>
-    </w:p>
-    <w:p>
-      <w:pPr>
-        <w:pStyle w:val="ListBullet"/>
-      </w:pPr>
-      <w:r>
-        <w:t>Step 3 - Export: Write the customer segment mapping to data/processed/customer_segments.csv.</w:t>
+        <w:t>• Step 1 - Group Transactions: We write `src/features/create_customer_segments.py` to aggregate sales features by each unique customer, calculating their average bill size (AOV).</w:t>
+        <w:br/>
+        <w:t>• Step 2 - Segment Thresholds: We write a python function to assign each customer to a group based on their average bill: Big Spenders (Average spend &gt;= ₹170), Frequent Shoppers (Average spend ₹100 to ₹170), Normal Shoppers (Average spend ₹50 to ₹100), and Rare Shoppers (Average spend &lt; ₹50).</w:t>
+        <w:br/>
+        <w:t>• Step 3 - Export: We save this customer classification map to `data/processed/customer_segments.csv`.</w:t>
       </w:r>
     </w:p>
     <w:p>
@@ -614,7 +693,6 @@
       </w:pPr>
       <w:r>
         <w:rPr>
-          <w:rFonts w:ascii="Calibri" w:hAnsi="Calibri"/>
           <w:b/>
           <w:sz w:val="24"/>
         </w:rPr>
@@ -622,27 +700,31 @@
       </w:r>
     </w:p>
     <w:p>
-      <w:pPr>
-        <w:pStyle w:val="ListBullet"/>
-      </w:pPr>
       <w:r>
-        <w:t>Step 1 - UI Mapping: In dashboard/pages/3_Customer_Analytics.py, map 'Premium' to 'Big Spenders', 'High Value' to 'Frequent Shoppers', 'Regular' to 'Normal Shoppers', and 'Occasional' to 'Rare Shoppers'.</w:t>
+        <w:t>In business, people use technical words like 'Premium', 'High Value', or 'AOV' (Average Order Value). To make our dashboard accessible to any store employee, we translate these terms into clear English names in our code. We map them to simple phrases, group the sales dataset by these simple names, and double check that the calculated values are distinct (e.g. Big Spenders spend a lot per order, while Rare Shoppers spend very little).</w:t>
+      </w:r>
+    </w:p>
+    <w:p>
+      <w:r>
+        <w:t>• Step 1 - UI Mapping: In `dashboard/pages/3_Customer_Analytics.py`, we write mapping code that translates database names ('Premium' to 'Big Spenders', 'High Value' to 'Frequent Shoppers', 'Regular' to 'Normal Shoppers', and 'Occasional' to 'Rare Shoppers').</w:t>
+        <w:br/>
+        <w:t>• Step 2 - Aggregate Segments: We group total sales revenue, profit, and order counts by these new names using Pandas.</w:t>
+        <w:br/>
+        <w:t>• Step 3 - Verify Calculations: We verify that the average spends are distinct and correct (e.g., Big Spenders average spend is ₹401, while Rare Shoppers is ₹37) to confirm that our segmentation model works.</w:t>
       </w:r>
     </w:p>
     <w:p>
       <w:pPr>
-        <w:pStyle w:val="ListBullet"/>
+        <w:jc w:val="center"/>
       </w:pPr>
       <w:r>
-        <w:t>Step 2 - Aggregate Segments: Group sales by customer segment to compute total sales, actual profit, and average bill size (AOV) for each customer type.</w:t>
-      </w:r>
-    </w:p>
-    <w:p>
-      <w:pPr>
-        <w:pStyle w:val="ListBullet"/>
-      </w:pPr>
-      <w:r>
-        <w:t>Step 3 - Verify Calculations: Verify that the average spends are distinct (Big Spenders at ~₹401, Rare Shoppers at ~₹37) to ensure segments are behavior-based.</w:t>
+        <w:rPr>
+          <w:b/>
+          <w:color w:val="FF6400"/>
+        </w:rPr>
+        <w:br/>
+        <w:t>[INSERT SCREENSHOT 3 HERE: Customer Types Analysis dashboard page, showing the Sales composition Pie Chart and the Average Spend Bar Chart side-by-side, displaying distinct average spending levels (ranging from ₹37 to ₹401) for the four shopper types.]</w:t>
+        <w:br/>
       </w:r>
     </w:p>
     <w:p>
@@ -667,7 +749,6 @@
       </w:pPr>
       <w:r>
         <w:rPr>
-          <w:rFonts w:ascii="Calibri" w:hAnsi="Calibri"/>
           <w:b/>
           <w:sz w:val="28"/>
         </w:rPr>
@@ -676,7 +757,7 @@
     </w:p>
     <w:p>
       <w:r>
-        <w:t>In this milestone, we write backend helper functions to compute category rankings, marketing channel margins, and pricing elasticity models.</w:t>
+        <w:t>In this milestone, we write backend helper functions to compute category rankings, marketing channel margins, and pricing elasticity models. Think of this milestone as building the calculator modules that find which product categories sell the best, which ads make the most money, and what discount rates are optimal.</w:t>
       </w:r>
     </w:p>
     <w:p>
@@ -685,7 +766,6 @@
       </w:pPr>
       <w:r>
         <w:rPr>
-          <w:rFonts w:ascii="Calibri" w:hAnsi="Calibri"/>
           <w:b/>
           <w:sz w:val="24"/>
         </w:rPr>
@@ -693,27 +773,17 @@
       </w:r>
     </w:p>
     <w:p>
-      <w:pPr>
-        <w:pStyle w:val="ListBullet"/>
-      </w:pPr>
       <w:r>
-        <w:t>Step 1 - Category Analyzer: Implement category_analysis.py to group sales by category, rank them by sales volume and profit, and filter out unknown categories.</w:t>
+        <w:t>ROI stands for 'Return on Investment'. For a non-technical student, it is a way of asking: 'If I spend ₹1 on an ad, how many rupees of profit do I get back?'. If an ad makes ₹3 in profit, it has an ROI of 300% (it was highly worth it). If it makes only ₹0.50, it has an ROI of 50% (you lost money). We write calculations to rank product categories by sales volume and to compute the ROI of each marketing campaign.</w:t>
       </w:r>
     </w:p>
     <w:p>
-      <w:pPr>
-        <w:pStyle w:val="ListBullet"/>
-      </w:pPr>
       <w:r>
-        <w:t>Step 2 - ROI Engine: Implement campaign_roi_analysis.py to join campaign budgets with sales profits from order mappings. Calculate the ROI: ROI % = (Total Profit / Campaign Budget) * 100.</w:t>
-      </w:r>
-    </w:p>
-    <w:p>
-      <w:pPr>
-        <w:pStyle w:val="ListBullet"/>
-      </w:pPr>
-      <w:r>
-        <w:t>Step 3 - Performance Metrics: Output the calculated metrics as Pandas DataFrames ready to be styled as charts.</w:t>
+        <w:t>• Step 1 - Category Analyzer: We implement `category_analysis.py` to count total sales and actual profits for each product type, ranking them from highest to lowest and filtering out incomplete/unknown categories.</w:t>
+        <w:br/>
+        <w:t>• Step 2 - ROI Engine: We implement `campaign_roi_analysis.py` to join campaign budgets with sales profits from our mappings, calculating ROI % = (Total Profit / Campaign Budget) * 100.</w:t>
+        <w:br/>
+        <w:t>• Step 3 - Performance Metrics: We format the outputs into clean Pandas dataframes ready to be loaded by the UI.</w:t>
       </w:r>
     </w:p>
     <w:p>
@@ -722,7 +792,6 @@
       </w:pPr>
       <w:r>
         <w:rPr>
-          <w:rFonts w:ascii="Calibri" w:hAnsi="Calibri"/>
           <w:b/>
           <w:sz w:val="24"/>
         </w:rPr>
@@ -730,27 +799,31 @@
       </w:r>
     </w:p>
     <w:p>
-      <w:pPr>
-        <w:pStyle w:val="ListBullet"/>
-      </w:pPr>
       <w:r>
-        <w:t>Step 1 - Discount Effectiveness: Implement discount_effectiveness.py to analyze how different discount rates (0% to 30%) affect product sales volume and profit margin.</w:t>
+        <w:t>If you offer a 20% discount, more people will buy your product (sales volume increases), but you make less profit on each sale. If you offer 0% discount, you make a high profit per sale, but fewer people buy. The 'Profit Sweet Spot' is the discount rate where the balance between sales volume and margin per item results in the highest possible total profit for the store. Our engine simulates this relationship to make recommendations.</w:t>
+      </w:r>
+    </w:p>
+    <w:p>
+      <w:r>
+        <w:t>• Step 1 - Discount Effectiveness: We create `discount_effectiveness.py` to analyze historical sales data and map how different discount rates (0% to 30%) affect product sales volume and profit margins.</w:t>
+        <w:br/>
+        <w:t>• Step 2 - Promotion Engine: We implement `promotion_recommendation_engine.py` to run simulations that predict projected sales and profits under various discount scenarios.</w:t>
+        <w:br/>
+        <w:t>• Step 3 - Sweet Spot Logic: We write recommendation code that identifies the optimal discount percentage to maximize net actual profit.</w:t>
       </w:r>
     </w:p>
     <w:p>
       <w:pPr>
-        <w:pStyle w:val="ListBullet"/>
+        <w:jc w:val="center"/>
       </w:pPr>
       <w:r>
-        <w:t>Step 2 - Promotion Engine: Implement promotion_recommendation_engine.py to run predictive simulations on how future discount offers will alter projected sales and profit margins.</w:t>
-      </w:r>
-    </w:p>
-    <w:p>
-      <w:pPr>
-        <w:pStyle w:val="ListBullet"/>
-      </w:pPr>
-      <w:r>
-        <w:t>Step 3 - Sweet Spot Logic: Program recommendation rules to identify the 'profit sweet spot' where sales volume increases enough to maximize total actual profit.</w:t>
+        <w:rPr>
+          <w:b/>
+          <w:color w:val="FF6400"/>
+        </w:rPr>
+        <w:br/>
+        <w:t>[INSERT SCREENSHOT 4 HERE: Discount &amp; Price Helper dashboard page, displaying the dual-axis chart where the sales volume line rises and the profit margin line curves, clearly highlighting the 'Profit Sweet Spot' marker at the optimal discount rate.]</w:t>
+        <w:br/>
       </w:r>
     </w:p>
     <w:p>
@@ -775,7 +848,6 @@
       </w:pPr>
       <w:r>
         <w:rPr>
-          <w:rFonts w:ascii="Calibri" w:hAnsi="Calibri"/>
           <w:b/>
           <w:sz w:val="28"/>
         </w:rPr>
@@ -784,7 +856,7 @@
     </w:p>
     <w:p>
       <w:r>
-        <w:t>In this milestone, we build the Streamlit multi-page interface, implement the charts, and apply custom CSS styling for a full-screen layout.</w:t>
+        <w:t>In this milestone, we build the Streamlit multi-page interface, implement the charts, and apply custom CSS styling for a full-screen layout. Think of this milestone as designing the cockpit of a spaceship—we are putting all the dials, controls, and screens in place so the store owner can easily pilot their business.</w:t>
       </w:r>
     </w:p>
     <w:p>
@@ -793,7 +865,6 @@
       </w:pPr>
       <w:r>
         <w:rPr>
-          <w:rFonts w:ascii="Calibri" w:hAnsi="Calibri"/>
           <w:b/>
           <w:sz w:val="24"/>
         </w:rPr>
@@ -801,27 +872,17 @@
       </w:r>
     </w:p>
     <w:p>
-      <w:pPr>
-        <w:pStyle w:val="ListBullet"/>
-      </w:pPr>
       <w:r>
-        <w:t>Step 1 - App Portal: Create dashboard/app.py as the entrypoint portal of the application.</w:t>
+        <w:t>A Multi-Page Router acts like the navigation menu of a website. Instead of squeezing all the information onto one cramped screen, we split the application into separate pages (Executive, Product Types, Customer Types, Campaigns, Pricing, Recommendations, and AI Chat Assistant) and build a sidebar menu to switch between them cleanly.</w:t>
       </w:r>
     </w:p>
     <w:p>
-      <w:pPr>
-        <w:pStyle w:val="ListBullet"/>
-      </w:pPr>
       <w:r>
-        <w:t>Step 2 - Route Mapping: Configure dynamic page navigation using st.Page and st.navigation in app.py to define the sidebar menu list.</w:t>
-      </w:r>
-    </w:p>
-    <w:p>
-      <w:pPr>
-        <w:pStyle w:val="ListBullet"/>
-      </w:pPr>
-      <w:r>
-        <w:t>Step 3 - Session Cache: Store global variables (like LLM settings) in st.session_state so they persist during page switches.</w:t>
+        <w:t>• Step 1 - App Portal: We create `dashboard/app.py` as the entrypoint for the Streamlit server.</w:t>
+        <w:br/>
+        <w:t>• Step 2 - Route Mapping: We define page links using `st.Page` and run a navigation router `st.navigation` in `app.py` to control the sidebar links dynamically.</w:t>
+        <w:br/>
+        <w:t>• Step 3 - Session Cache: We configure `st.session_state` to share data (like user preferences) across pages without losing state during navigation.</w:t>
       </w:r>
     </w:p>
     <w:p>
@@ -830,7 +891,6 @@
       </w:pPr>
       <w:r>
         <w:rPr>
-          <w:rFonts w:ascii="Calibri" w:hAnsi="Calibri"/>
           <w:b/>
           <w:sz w:val="24"/>
         </w:rPr>
@@ -838,27 +898,17 @@
       </w:r>
     </w:p>
     <w:p>
-      <w:pPr>
-        <w:pStyle w:val="ListBullet"/>
-      </w:pPr>
       <w:r>
-        <w:t>Step 1 - Executive Dashboard: Build pages/1_Executive_Dashboard.py to display global KPI cards (Sales, Profit, Orders) and daily sales trends.</w:t>
+        <w:t>We build the layout for each dashboard tab. We use Plotly to generate interactive charts—where users can hover their mouse over bars to see the exact numbers, zoom in on data points, or hide specific items by clicking the legend.</w:t>
       </w:r>
     </w:p>
     <w:p>
-      <w:pPr>
-        <w:pStyle w:val="ListBullet"/>
-      </w:pPr>
       <w:r>
-        <w:t>Step 2 - Category &amp; Campaign: Build pages/2_Category_Analytics.py and pages/4_Campaign_Analytics.py to render horizontal bar charts of product sales and campaign ROI.</w:t>
-      </w:r>
-    </w:p>
-    <w:p>
-      <w:pPr>
-        <w:pStyle w:val="ListBullet"/>
-      </w:pPr>
-      <w:r>
-        <w:t>Step 3 - Customer &amp; Pricing: Build pages/3_Customer_Analytics.py, pages/5_Pricing_Analytics.py, and pages/6_Promotion_Recommendation.py to render customer types, discount curves, and the future profit calculator.</w:t>
+        <w:t>• Step 1 - Executive Dashboard: We build `pages/1_Executive_Dashboard.py` showing high-level KPI cards and daily sales trends.</w:t>
+        <w:br/>
+        <w:t>• Step 2 - Category &amp; Campaign: We build `pages/2_Category_Analytics.py` and `pages/4_Campaign_Analytics.py` showing horizontal bar charts ranking product sales and comparing campaign budgets against net earnings.</w:t>
+        <w:br/>
+        <w:t>• Step 3 - Customer &amp; Pricing: We build `pages/3_Customer_Analytics.py`, `pages/5_Pricing_Analytics.py`, and `pages/6_Promotion_Recommendation.py` to show customer spending distributions, discount profit curves, and the interactive future profit calculator.</w:t>
       </w:r>
     </w:p>
     <w:p>
@@ -867,7 +917,6 @@
       </w:pPr>
       <w:r>
         <w:rPr>
-          <w:rFonts w:ascii="Calibri" w:hAnsi="Calibri"/>
           <w:b/>
           <w:sz w:val="24"/>
         </w:rPr>
@@ -875,27 +924,31 @@
       </w:r>
     </w:p>
     <w:p>
-      <w:pPr>
-        <w:pStyle w:val="ListBullet"/>
-      </w:pPr>
       <w:r>
-        <w:t>Step 1 - Styles Sheet: Create dashboard/styles.py containing functions inject_custom_css(), render_kpi_card(), and get_plotly_layout().</w:t>
+        <w:t>By default, standard Streamlit pages can look simple and are restricted to a narrow centered column. CSS (Cascading Style Sheets) is the language used to style web layouts. We inject custom CSS to apply a premium 'dark glassmorphism' theme—which uses dark blue semi-transparent cards, soft borders, glowing shadows, and the modern 'Outfit' font. We also use CSS to expand the page width to 95%, forcing elements to spread out and use the full screen.</w:t>
+      </w:r>
+    </w:p>
+    <w:p>
+      <w:r>
+        <w:t>• Step 1 - Styles Sheet: We write `dashboard/styles.py` containing styling functions: `inject_custom_css` for page overrides, `render_kpi_card` for custom metric cards, and `get_plotly_layout` for Plotly styling.</w:t>
+        <w:br/>
+        <w:t>• Step 2 - Full Width CSS: We inject CSS code targeting the classes `.block-container` and `stMainBlockContainer` to set their max-width to 95%, forcing the content to take up the full screen width.</w:t>
+        <w:br/>
+        <w:t>• Step 3 - Glassmorphism UI: We implement styling tokens (colors, blur filters, fonts) to give the application a premium look.</w:t>
       </w:r>
     </w:p>
     <w:p>
       <w:pPr>
-        <w:pStyle w:val="ListBullet"/>
+        <w:jc w:val="center"/>
       </w:pPr>
       <w:r>
-        <w:t>Step 2 - Full Width CSS: Inject CSS rules into the Streamlit .block-container and stMainBlockContainer to expand width to 95%, forcing content to span the full screen.</w:t>
-      </w:r>
-    </w:p>
-    <w:p>
-      <w:pPr>
-        <w:pStyle w:val="ListBullet"/>
-      </w:pPr>
-      <w:r>
-        <w:t>Step 3 - Glassmorphism UI: Define glassmorphism card containers and Outfit typography, styling Plotly figures to fit the premium dark/glass design system.</w:t>
+        <w:rPr>
+          <w:b/>
+          <w:color w:val="FF6400"/>
+        </w:rPr>
+        <w:br/>
+        <w:t>[INSERT SCREENSHOT 5 HERE: Executive Dashboard page, showing the main header, the four glassmorphism metric cards (Sales, Profit, Margin, Orders) with hover shadows, and the wide-layout daily sales trend graph spanning the screen width.]</w:t>
+        <w:br/>
       </w:r>
     </w:p>
     <w:p>
@@ -920,7 +973,6 @@
       </w:pPr>
       <w:r>
         <w:rPr>
-          <w:rFonts w:ascii="Calibri" w:hAnsi="Calibri"/>
           <w:b/>
           <w:sz w:val="28"/>
         </w:rPr>
@@ -929,7 +981,7 @@
     </w:p>
     <w:p>
       <w:r>
-        <w:t>In this milestone, we construct the offline conversational agent, integrating it with the chat UI for natural language database queries.</w:t>
+        <w:t>In this milestone, we construct the offline conversational agent, integrating it with the chat UI for natural language database queries. Think of this milestone as hiring a smart shop consultant who knows all your database tables and can instantly answer questions typed in plain English.</w:t>
       </w:r>
     </w:p>
     <w:p>
@@ -938,7 +990,6 @@
       </w:pPr>
       <w:r>
         <w:rPr>
-          <w:rFonts w:ascii="Calibri" w:hAnsi="Calibri"/>
           <w:b/>
           <w:sz w:val="24"/>
         </w:rPr>
@@ -946,27 +997,17 @@
       </w:r>
     </w:p>
     <w:p>
-      <w:pPr>
-        <w:pStyle w:val="ListBullet"/>
-      </w:pPr>
       <w:r>
-        <w:t>Step 1 - Agent Engine: Implement src/agents/agent_engine.py to define the RetailAgent class.</w:t>
+        <w:t>An AI agent usually requires a paid internet connection and API keys to work. Since this app might be deployed to general shop employees, we want it to run completely offline without cost or API key leaks. We write a local 'SQL Query Generator' that acts as the fallback brain. It scans the user's English sentence, translates it into a database query, executes it locally, and simplifies the raw data outputs into easy-to-understand terms.</w:t>
       </w:r>
     </w:p>
     <w:p>
-      <w:pPr>
-        <w:pStyle w:val="ListBullet"/>
-      </w:pPr>
       <w:r>
-        <w:t>Step 2 - Offline Fallback Processor: Program a local SQL query generator that intercepts questions and runs offline lookups on the database tables if no API key is provided.</w:t>
-      </w:r>
-    </w:p>
-    <w:p>
-      <w:pPr>
-        <w:pStyle w:val="ListBullet"/>
-      </w:pPr>
-      <w:r>
-        <w:t>Step 3 - Response Post-processing: Add text replacements to intercept LLM outputs and replace technical terms (e.g. 'AOV', 'revenue', 'ROI') with simple terms (e.g. 'average bill size', 'sales', 'profit worth') before displaying.</w:t>
+        <w:t>• Step 1 - Agent Engine: We write `src/agents/agent_engine.py` to define the main `RetailAgent` class.</w:t>
+        <w:br/>
+        <w:t>• Step 2 - Offline Fallback Processor: We program a local query processor that scans for keyword patterns (like 'ads', 'profit', 'discounts') and maps them to pre-programmed SQL database queries, running them offline on our SQLite file.</w:t>
+        <w:br/>
+        <w:t>• Step 3 - Response Post-processing: We add string replacement filters to clean up the agent's output. Any technical terms like 'revenue' or 'AOV' are translated to simple words like 'sales' or 'average bill size' before being shown.</w:t>
       </w:r>
     </w:p>
     <w:p>
@@ -975,7 +1016,6 @@
       </w:pPr>
       <w:r>
         <w:rPr>
-          <w:rFonts w:ascii="Calibri" w:hAnsi="Calibri"/>
           <w:b/>
           <w:sz w:val="24"/>
         </w:rPr>
@@ -983,27 +1023,31 @@
       </w:r>
     </w:p>
     <w:p>
-      <w:pPr>
-        <w:pStyle w:val="ListBullet"/>
-      </w:pPr>
       <w:r>
-        <w:t>Step 1 - Chat Interface: Create pages/7_AI_Decision_Agent.py using st.chat_input, st.chat_message, and a conversational loop.</w:t>
+        <w:t>We build a user-friendly chat interface with bubbles for messages. To make it even easier for users, we add 'Quick Question Chips' (clickable buttons) at the top of the page. Clicking a chip automatically submits a common question (like 'What discount makes the most profit?'), giving the user instant answers in one click. We also remove all API key inputs from the sidebar, locking the app into this secure offline mode.</w:t>
+      </w:r>
+    </w:p>
+    <w:p>
+      <w:r>
+        <w:t>• Step 1 - Chat Interface: We create `pages/7_AI_Decision_Agent.py` using Streamlit's chat components (`st.chat_input` and `st.chat_message`) and set up the chat loop.</w:t>
+        <w:br/>
+        <w:t>• Step 2 - Quick Chips: We write a row of columns at the top containing four clickable buttons (Best Discounts, Best Ads, Customer Profit, Best Product Types) that auto-submit questions.</w:t>
+        <w:br/>
+        <w:t>• Step 3 - Secure Lock: We delete the API key text fields from the sidebar, securing the app exclusively for offline demo use.</w:t>
       </w:r>
     </w:p>
     <w:p>
       <w:pPr>
-        <w:pStyle w:val="ListBullet"/>
+        <w:jc w:val="center"/>
       </w:pPr>
       <w:r>
-        <w:t>Step 2 - Quick Chips: Render clickable buttons for common questions (e.g. 'Best Discounts', 'Best Ads', 'Customer Profit') to submit queries automatically.</w:t>
-      </w:r>
-    </w:p>
-    <w:p>
-      <w:pPr>
-        <w:pStyle w:val="ListBullet"/>
-      </w:pPr>
-      <w:r>
-        <w:t>Step 3 - Secure Lock: Remove API key config text inputs from the sidebar and lock the agent to run exclusively in the secure, offline Demo Mode.</w:t>
+        <w:rPr>
+          <w:b/>
+          <w:color w:val="FF6400"/>
+        </w:rPr>
+        <w:br/>
+        <w:t>[INSERT SCREENSHOT 6 HERE: AI Shop Assistant page, displaying the four Quick Question Chips at the top, a user query bubble ('What discount makes the most profit?'), and the assistant's response bubble explaining the optimal 10% discount sweet spot using simple English terms.]</w:t>
+        <w:br/>
       </w:r>
     </w:p>
     <w:p>

</xml_diff>